<commit_message>
docs: cap nhat bao cao nop cuoi DT011 (sua trinh bay, bo sung chu ky)
</commit_message>
<xml_diff>
--- a/docs/baocao-cuoi/N24DCDT022_DT011_TranHuuDuy_BaoCao.docx
+++ b/docs/baocao-cuoi/N24DCDT022_DT011_TranHuuDuy_BaoCao.docx
@@ -1766,7 +1766,7 @@
     <w:p>
       <w:pPr>
         <w:pStyle w:val="Nidung"/>
-        <w:spacing w:before="0" w:after="100" w:line="269" w:lineRule="auto"/>
+        <w:spacing w:before="360" w:after="100" w:line="269" w:lineRule="auto"/>
         <w:ind w:firstLine="0"/>
         <w:jc w:val="center"/>
       </w:pPr>
@@ -1775,6 +1775,39 @@
           <w:rFonts w:ascii="Times New Roman" w:hAnsi="Times New Roman" w:cs="Times New Roman" w:eastAsia="Times New Roman"/>
         </w:rPr>
         <w:t>TP. Hồ Chí Minh, ngày 23 tháng 10 năm 2026</w:t>
+      </w:r>
+    </w:p>
+    <w:p>
+      <w:pPr>
+        <w:jc w:val="center"/>
+      </w:pPr>
+      <w:r>
+        <w:t>Sinh viên thực hiện</w:t>
+      </w:r>
+    </w:p>
+    <w:p>
+      <w:pPr>
+        <w:jc w:val="center"/>
+      </w:pPr>
+      <w:r>
+        <w:t>(Ký và ghi rõ họ tên)</w:t>
+      </w:r>
+    </w:p>
+    <w:p>
+      <w:pPr>
+        <w:jc w:val="center"/>
+      </w:pPr>
+    </w:p>
+    <w:p>
+      <w:pPr>
+        <w:jc w:val="center"/>
+      </w:pPr>
+      <w:r>
+        <w:rPr>
+          <w:b/>
+          <w:sz w:val="26"/>
+        </w:rPr>
+        <w:t>TRẦN HỮU DUY</w:t>
       </w:r>
     </w:p>
     <w:p>
@@ -4109,7 +4142,7 @@
             <w:noProof/>
             <w:webHidden/>
           </w:rPr>
-          <w:t>13</w:t>
+          <w:t>11</w:t>
         </w:r>
         <w:r>
           <w:rPr>
@@ -4191,7 +4224,7 @@
             <w:noProof/>
             <w:webHidden/>
           </w:rPr>
-          <w:t>14</w:t>
+          <w:t>13</w:t>
         </w:r>
         <w:r>
           <w:rPr>
@@ -4273,7 +4306,7 @@
             <w:noProof/>
             <w:webHidden/>
           </w:rPr>
-          <w:t>15</w:t>
+          <w:t>14</w:t>
         </w:r>
         <w:r>
           <w:rPr>
@@ -4355,7 +4388,7 @@
             <w:noProof/>
             <w:webHidden/>
           </w:rPr>
-          <w:t>16</w:t>
+          <w:t>15</w:t>
         </w:r>
         <w:r>
           <w:rPr>
@@ -4437,7 +4470,7 @@
             <w:noProof/>
             <w:webHidden/>
           </w:rPr>
-          <w:t>16</w:t>
+          <w:t>15</w:t>
         </w:r>
         <w:r>
           <w:rPr>
@@ -4519,7 +4552,7 @@
             <w:noProof/>
             <w:webHidden/>
           </w:rPr>
-          <w:t>16</w:t>
+          <w:t>15</w:t>
         </w:r>
         <w:r>
           <w:rPr>
@@ -4550,7 +4583,7 @@
       <w:r>
         <w:t>4.9. GitHub và chạy lại từ bản clone tại commit C</w:t>
         <w:tab/>
-        <w:t>18</w:t>
+        <w:t>17</w:t>
       </w:r>
       <w:r/>
       <w:r/>
@@ -4577,7 +4610,7 @@
         </w:rPr>
         <w:t>4.10. Mô phỏng trực quan (tuỳ chọn)</w:t>
         <w:tab/>
-        <w:t>20</w:t>
+        <w:t>19</w:t>
       </w:r>
     </w:p>
     <w:p>
@@ -4650,7 +4683,7 @@
             <w:noProof/>
             <w:webHidden/>
           </w:rPr>
-          <w:t>21</w:t>
+          <w:t>20</w:t>
         </w:r>
         <w:r>
           <w:rPr>
@@ -4732,7 +4765,7 @@
             <w:noProof/>
             <w:webHidden/>
           </w:rPr>
-          <w:t>21</w:t>
+          <w:t>20</w:t>
         </w:r>
         <w:r>
           <w:rPr>
@@ -4814,7 +4847,7 @@
             <w:noProof/>
             <w:webHidden/>
           </w:rPr>
-          <w:t>21</w:t>
+          <w:t>20</w:t>
         </w:r>
         <w:r>
           <w:rPr>
@@ -4896,7 +4929,7 @@
             <w:noProof/>
             <w:webHidden/>
           </w:rPr>
-          <w:t>21</w:t>
+          <w:t>20</w:t>
         </w:r>
         <w:r>
           <w:rPr>
@@ -4978,7 +5011,7 @@
             <w:noProof/>
             <w:webHidden/>
           </w:rPr>
-          <w:t>22</w:t>
+          <w:t>21</w:t>
         </w:r>
         <w:r>
           <w:rPr>
@@ -6366,7 +6399,7 @@
             <w:noProof/>
             <w:webHidden/>
           </w:rPr>
-          <w:t>12</w:t>
+          <w:t>11</w:t>
         </w:r>
         <w:r>
           <w:rPr>
@@ -6400,7 +6433,7 @@
         </w:rPr>
         <w:t>Bảng 4.4 Khảo sát bốn quy mô Q1–Q4</w:t>
         <w:tab/>
-        <w:t>17</w:t>
+        <w:t>16</w:t>
       </w:r>
     </w:p>
     <w:p>
@@ -6473,7 +6506,7 @@
             <w:noProof/>
             <w:webHidden/>
           </w:rPr>
-          <w:t>19</w:t>
+          <w:t>17</w:t>
         </w:r>
         <w:r>
           <w:rPr>
@@ -6555,7 +6588,7 @@
             <w:noProof/>
             <w:webHidden/>
           </w:rPr>
-          <w:t>22</w:t>
+          <w:t>20</w:t>
         </w:r>
         <w:r>
           <w:rPr>
@@ -6771,7 +6804,7 @@
             <w:noProof/>
             <w:webHidden/>
           </w:rPr>
-          <w:t>13</w:t>
+          <w:t>11</w:t>
         </w:r>
         <w:r>
           <w:rPr>
@@ -6853,7 +6886,7 @@
             <w:noProof/>
             <w:webHidden/>
           </w:rPr>
-          <w:t>13</w:t>
+          <w:t>12</w:t>
         </w:r>
         <w:r>
           <w:rPr>
@@ -6935,7 +6968,7 @@
             <w:noProof/>
             <w:webHidden/>
           </w:rPr>
-          <w:t>14</w:t>
+          <w:t>13</w:t>
         </w:r>
         <w:r>
           <w:rPr>
@@ -7017,7 +7050,7 @@
             <w:noProof/>
             <w:webHidden/>
           </w:rPr>
-          <w:t>14</w:t>
+          <w:t>13</w:t>
         </w:r>
         <w:r>
           <w:rPr>
@@ -7052,7 +7085,7 @@
         <w:tab/>
       </w:r>
       <w:r>
-        <w:t>15</w:t>
+        <w:t>14</w:t>
       </w:r>
     </w:p>
     <w:p>
@@ -7078,7 +7111,7 @@
         <w:tab/>
       </w:r>
       <w:r>
-        <w:t>15</w:t>
+        <w:t>14</w:t>
       </w:r>
     </w:p>
     <w:p>
@@ -7104,7 +7137,7 @@
         <w:tab/>
       </w:r>
       <w:r>
-        <w:t>16</w:t>
+        <w:t>15</w:t>
       </w:r>
     </w:p>
     <w:p>
@@ -7177,7 +7210,7 @@
             <w:noProof/>
             <w:webHidden/>
           </w:rPr>
-          <w:t>16</w:t>
+          <w:t>15</w:t>
         </w:r>
         <w:r>
           <w:rPr>
@@ -7212,7 +7245,7 @@
         <w:tab/>
       </w:r>
       <w:r>
-        <w:t>17</w:t>
+        <w:t>15</w:t>
       </w:r>
     </w:p>
     <w:p>
@@ -7247,7 +7280,7 @@
         <w:rPr>
           <w:rFonts w:ascii="Times New Roman" w:hAnsi="Times New Roman" w:cs="Times New Roman" w:eastAsia="Times New Roman"/>
         </w:rPr>
-        <w:t>20</w:t>
+        <w:t>18</w:t>
       </w:r>
     </w:p>
     <w:p>
@@ -7273,7 +7306,7 @@
         <w:tab/>
       </w:r>
       <w:r>
-        <w:t>20</w:t>
+        <w:t>18</w:t>
       </w:r>
     </w:p>
     <w:p>
@@ -12270,6 +12303,7 @@
               <w:rPr>
                 <w:rFonts w:ascii="Times New Roman" w:hAnsi="Times New Roman" w:cs="Times New Roman" w:eastAsia="Times New Roman"/>
                 <w:b/>
+                <w:sz w:val="24"/>
               </w:rPr>
               <w:t>Ca</w:t>
             </w:r>
@@ -12289,6 +12323,7 @@
               <w:rPr>
                 <w:rFonts w:ascii="Times New Roman" w:hAnsi="Times New Roman" w:cs="Times New Roman" w:eastAsia="Times New Roman"/>
                 <w:b/>
+                <w:sz w:val="24"/>
               </w:rPr>
               <w:t>Nguồn và đối tượng</w:t>
             </w:r>
@@ -12308,6 +12343,7 @@
               <w:rPr>
                 <w:rFonts w:ascii="Times New Roman" w:hAnsi="Times New Roman" w:cs="Times New Roman" w:eastAsia="Times New Roman"/>
                 <w:b/>
+                <w:sz w:val="24"/>
               </w:rPr>
               <w:t>Input đủ tái hiện</w:t>
             </w:r>
@@ -12327,6 +12363,7 @@
               <w:rPr>
                 <w:rFonts w:ascii="Times New Roman" w:hAnsi="Times New Roman" w:cs="Times New Roman" w:eastAsia="Times New Roman"/>
                 <w:b/>
+                <w:sz w:val="24"/>
               </w:rPr>
               <w:t>Expected và cách kiểm</w:t>
             </w:r>
@@ -12350,6 +12387,7 @@
             <w:r>
               <w:rPr>
                 <w:rFonts w:ascii="Times New Roman" w:hAnsi="Times New Roman" w:cs="Times New Roman" w:eastAsia="Times New Roman"/>
+                <w:sz w:val="24"/>
               </w:rPr>
               <w:t xml:space="preserve">VD01</w:t>
             </w:r>
@@ -12367,6 +12405,7 @@
             <w:r>
               <w:rPr>
                 <w:rFonts w:ascii="Times New Roman" w:hAnsi="Times New Roman" w:cs="Times New Roman" w:eastAsia="Times New Roman"/>
+                <w:sz w:val="24"/>
               </w:rPr>
               <w:t xml:space="preserve">Ví dụ 1 phiếu / sap_xep_lua_chon</w:t>
             </w:r>
@@ -12384,6 +12423,7 @@
             <w:r>
               <w:rPr>
                 <w:rFonts w:ascii="Times New Roman" w:hAnsi="Times New Roman" w:cs="Times New Roman" w:eastAsia="Times New Roman"/>
+                <w:sz w:val="24"/>
               </w:rPr>
               <w:t xml:space="preserve">[8,3,5,1,9,2]</w:t>
             </w:r>
@@ -12401,6 +12441,7 @@
             <w:r>
               <w:rPr>
                 <w:rFonts w:ascii="Times New Roman" w:hAnsi="Times New Roman" w:cs="Times New Roman" w:eastAsia="Times New Roman"/>
+                <w:sz w:val="24"/>
               </w:rPr>
               <w:t xml:space="preserve">ra [1,2,3,5,8,9]; so_sanh=15; so_doi=5</w:t>
             </w:r>
@@ -12424,6 +12465,7 @@
             <w:r>
               <w:rPr>
                 <w:rFonts w:ascii="Times New Roman" w:hAnsi="Times New Roman" w:cs="Times New Roman" w:eastAsia="Times New Roman"/>
+                <w:sz w:val="24"/>
               </w:rPr>
               <w:t xml:space="preserve">VD02</w:t>
             </w:r>
@@ -12441,6 +12483,7 @@
             <w:r>
               <w:rPr>
                 <w:rFonts w:ascii="Times New Roman" w:hAnsi="Times New Roman" w:cs="Times New Roman" w:eastAsia="Times New Roman"/>
+                <w:sz w:val="24"/>
               </w:rPr>
               <w:t xml:space="preserve">Ví dụ 2 phiếu / sap_xep_lua_chon</w:t>
             </w:r>
@@ -12458,6 +12501,7 @@
             <w:r>
               <w:rPr>
                 <w:rFonts w:ascii="Times New Roman" w:hAnsi="Times New Roman" w:cs="Times New Roman" w:eastAsia="Times New Roman"/>
+                <w:sz w:val="24"/>
               </w:rPr>
               <w:t xml:space="preserve">[2,1,2]</w:t>
             </w:r>
@@ -12475,6 +12519,7 @@
             <w:r>
               <w:rPr>
                 <w:rFonts w:ascii="Times New Roman" w:hAnsi="Times New Roman" w:cs="Times New Roman" w:eastAsia="Times New Roman"/>
+                <w:sz w:val="24"/>
               </w:rPr>
               <w:t xml:space="preserve">ra [1,2,2]; so_sanh=3; so_doi=1</w:t>
             </w:r>
@@ -12498,6 +12543,7 @@
             <w:r>
               <w:rPr>
                 <w:rFonts w:ascii="Times New Roman" w:hAnsi="Times New Roman" w:cs="Times New Roman" w:eastAsia="Times New Roman"/>
+                <w:sz w:val="24"/>
               </w:rPr>
               <w:t xml:space="preserve">TK01</w:t>
             </w:r>
@@ -12515,6 +12561,7 @@
             <w:r>
               <w:rPr>
                 <w:rFonts w:ascii="Times New Roman" w:hAnsi="Times New Roman" w:cs="Times New Roman" w:eastAsia="Times New Roman"/>
+                <w:sz w:val="24"/>
               </w:rPr>
               <w:t xml:space="preserve">Tự thiết kế 1 (trùng 1) / sap_xep_lua_chon</w:t>
             </w:r>
@@ -12532,6 +12579,7 @@
             <w:r>
               <w:rPr>
                 <w:rFonts w:ascii="Times New Roman" w:hAnsi="Times New Roman" w:cs="Times New Roman" w:eastAsia="Times New Roman"/>
+                <w:sz w:val="24"/>
               </w:rPr>
               <w:t xml:space="preserve">[5,1,4,1,3]</w:t>
             </w:r>
@@ -12549,6 +12597,7 @@
             <w:r>
               <w:rPr>
                 <w:rFonts w:ascii="Times New Roman" w:hAnsi="Times New Roman" w:cs="Times New Roman" w:eastAsia="Times New Roman"/>
+                <w:sz w:val="24"/>
               </w:rPr>
               <w:t xml:space="preserve">ra [1,1,3,4,5]; so_doi=4</w:t>
             </w:r>
@@ -12572,6 +12621,7 @@
             <w:r>
               <w:rPr>
                 <w:rFonts w:ascii="Times New Roman" w:hAnsi="Times New Roman" w:cs="Times New Roman" w:eastAsia="Times New Roman"/>
+                <w:sz w:val="24"/>
               </w:rPr>
               <w:t xml:space="preserve">TK02</w:t>
             </w:r>
@@ -12589,6 +12639,7 @@
             <w:r>
               <w:rPr>
                 <w:rFonts w:ascii="Times New Roman" w:hAnsi="Times New Roman" w:cs="Times New Roman" w:eastAsia="Times New Roman"/>
+                <w:sz w:val="24"/>
               </w:rPr>
               <w:t xml:space="preserve">Tự thiết kế 2 (giảm dần) / sap_xep_lua_chon</w:t>
             </w:r>
@@ -12606,6 +12657,7 @@
             <w:r>
               <w:rPr>
                 <w:rFonts w:ascii="Times New Roman" w:hAnsi="Times New Roman" w:cs="Times New Roman" w:eastAsia="Times New Roman"/>
+                <w:sz w:val="24"/>
               </w:rPr>
               <w:t xml:space="preserve">[9,7,5,3,1]</w:t>
             </w:r>
@@ -12623,6 +12675,7 @@
             <w:r>
               <w:rPr>
                 <w:rFonts w:ascii="Times New Roman" w:hAnsi="Times New Roman" w:cs="Times New Roman" w:eastAsia="Times New Roman"/>
+                <w:sz w:val="24"/>
               </w:rPr>
               <w:t xml:space="preserve">ra [1,3,5,7,9]; so_doi=2</w:t>
             </w:r>
@@ -12646,6 +12699,7 @@
             <w:r>
               <w:rPr>
                 <w:rFonts w:ascii="Times New Roman" w:hAnsi="Times New Roman" w:cs="Times New Roman" w:eastAsia="Times New Roman"/>
+                <w:sz w:val="24"/>
               </w:rPr>
               <w:t xml:space="preserve">BIEN01</w:t>
             </w:r>
@@ -12663,6 +12717,7 @@
             <w:r>
               <w:rPr>
                 <w:rFonts w:ascii="Times New Roman" w:hAnsi="Times New Roman" w:cs="Times New Roman" w:eastAsia="Times New Roman"/>
+                <w:sz w:val="24"/>
               </w:rPr>
               <w:t xml:space="preserve">Biên rỗng / sap_xep_lua_chon</w:t>
             </w:r>
@@ -12680,6 +12735,7 @@
             <w:r>
               <w:rPr>
                 <w:rFonts w:ascii="Times New Roman" w:hAnsi="Times New Roman" w:cs="Times New Roman" w:eastAsia="Times New Roman"/>
+                <w:sz w:val="24"/>
               </w:rPr>
               <w:t xml:space="preserve">Int[]</w:t>
             </w:r>
@@ -12697,6 +12753,7 @@
             <w:r>
               <w:rPr>
                 <w:rFonts w:ascii="Times New Roman" w:hAnsi="Times New Roman" w:cs="Times New Roman" w:eastAsia="Times New Roman"/>
+                <w:sz w:val="24"/>
               </w:rPr>
               <w:t xml:space="preserve">ra Int[]; so_sanh=0; so_doi=0</w:t>
             </w:r>
@@ -12720,6 +12777,7 @@
             <w:r>
               <w:rPr>
                 <w:rFonts w:ascii="Times New Roman" w:hAnsi="Times New Roman" w:cs="Times New Roman" w:eastAsia="Times New Roman"/>
+                <w:sz w:val="24"/>
               </w:rPr>
               <w:t xml:space="preserve">BIEN02</w:t>
             </w:r>
@@ -12737,6 +12795,7 @@
             <w:r>
               <w:rPr>
                 <w:rFonts w:ascii="Times New Roman" w:hAnsi="Times New Roman" w:cs="Times New Roman" w:eastAsia="Times New Roman"/>
+                <w:sz w:val="24"/>
               </w:rPr>
               <w:t xml:space="preserve">Biên một phần tử / sap_xep_lua_chon</w:t>
             </w:r>
@@ -12754,6 +12813,7 @@
             <w:r>
               <w:rPr>
                 <w:rFonts w:ascii="Times New Roman" w:hAnsi="Times New Roman" w:cs="Times New Roman" w:eastAsia="Times New Roman"/>
+                <w:sz w:val="24"/>
               </w:rPr>
               <w:t xml:space="preserve">[7]</w:t>
             </w:r>
@@ -12771,6 +12831,7 @@
             <w:r>
               <w:rPr>
                 <w:rFonts w:ascii="Times New Roman" w:hAnsi="Times New Roman" w:cs="Times New Roman" w:eastAsia="Times New Roman"/>
+                <w:sz w:val="24"/>
               </w:rPr>
               <w:t xml:space="preserve">ra [7]; so_sanh=0; so_doi=0</w:t>
             </w:r>
@@ -12794,6 +12855,7 @@
             <w:r>
               <w:rPr>
                 <w:rFonts w:ascii="Times New Roman" w:hAnsi="Times New Roman" w:cs="Times New Roman" w:eastAsia="Times New Roman"/>
+                <w:sz w:val="24"/>
               </w:rPr>
               <w:t xml:space="preserve">BIEN03</w:t>
             </w:r>
@@ -12811,6 +12873,7 @@
             <w:r>
               <w:rPr>
                 <w:rFonts w:ascii="Times New Roman" w:hAnsi="Times New Roman" w:cs="Times New Roman" w:eastAsia="Times New Roman"/>
+                <w:sz w:val="24"/>
               </w:rPr>
               <w:t xml:space="preserve">Biên toàn trùng / sap_xep_lua_chon</w:t>
             </w:r>
@@ -12828,6 +12891,7 @@
             <w:r>
               <w:rPr>
                 <w:rFonts w:ascii="Times New Roman" w:hAnsi="Times New Roman" w:cs="Times New Roman" w:eastAsia="Times New Roman"/>
+                <w:sz w:val="24"/>
               </w:rPr>
               <w:t xml:space="preserve">[4,4,4]</w:t>
             </w:r>
@@ -12845,6 +12909,7 @@
             <w:r>
               <w:rPr>
                 <w:rFonts w:ascii="Times New Roman" w:hAnsi="Times New Roman" w:cs="Times New Roman" w:eastAsia="Times New Roman"/>
+                <w:sz w:val="24"/>
               </w:rPr>
               <w:t xml:space="preserve">ra [4,4,4]; so_sanh=3; so_doi=0</w:t>
             </w:r>
@@ -12868,6 +12933,7 @@
             <w:r>
               <w:rPr>
                 <w:rFonts w:ascii="Times New Roman" w:hAnsi="Times New Roman" w:cs="Times New Roman" w:eastAsia="Times New Roman"/>
+                <w:sz w:val="24"/>
               </w:rPr>
               <w:t xml:space="preserve">BIEN04</w:t>
             </w:r>
@@ -12885,6 +12951,7 @@
             <w:r>
               <w:rPr>
                 <w:rFonts w:ascii="Times New Roman" w:hAnsi="Times New Roman" w:cs="Times New Roman" w:eastAsia="Times New Roman"/>
+                <w:sz w:val="24"/>
               </w:rPr>
               <w:t xml:space="preserve">Biên đã tăng / sap_xep_lua_chon</w:t>
             </w:r>
@@ -12902,6 +12969,7 @@
             <w:r>
               <w:rPr>
                 <w:rFonts w:ascii="Times New Roman" w:hAnsi="Times New Roman" w:cs="Times New Roman" w:eastAsia="Times New Roman"/>
+                <w:sz w:val="24"/>
               </w:rPr>
               <w:t xml:space="preserve">[1,2,3]</w:t>
             </w:r>
@@ -12919,6 +12987,7 @@
             <w:r>
               <w:rPr>
                 <w:rFonts w:ascii="Times New Roman" w:hAnsi="Times New Roman" w:cs="Times New Roman" w:eastAsia="Times New Roman"/>
+                <w:sz w:val="24"/>
               </w:rPr>
               <w:t xml:space="preserve">ra [1,2,3]; so_sanh=3; so_doi=0</w:t>
             </w:r>
@@ -12942,6 +13011,7 @@
             <w:r>
               <w:rPr>
                 <w:rFonts w:ascii="Times New Roman" w:hAnsi="Times New Roman" w:cs="Times New Roman" w:eastAsia="Times New Roman"/>
+                <w:sz w:val="24"/>
               </w:rPr>
               <w:t xml:space="preserve">KT01</w:t>
             </w:r>
@@ -12959,6 +13029,7 @@
             <w:r>
               <w:rPr>
                 <w:rFonts w:ascii="Times New Roman" w:hAnsi="Times New Roman" w:cs="Times New Roman" w:eastAsia="Times New Roman"/>
+                <w:sz w:val="24"/>
               </w:rPr>
               <w:t xml:space="preserve">Số âm xen kẽ / sap_xep_lua_chon</w:t>
             </w:r>
@@ -12976,6 +13047,7 @@
             <w:r>
               <w:rPr>
                 <w:rFonts w:ascii="Times New Roman" w:hAnsi="Times New Roman" w:cs="Times New Roman" w:eastAsia="Times New Roman"/>
+                <w:sz w:val="24"/>
               </w:rPr>
               <w:t xml:space="preserve">[3,-1,3,-1,0]</w:t>
             </w:r>
@@ -12993,6 +13065,7 @@
             <w:r>
               <w:rPr>
                 <w:rFonts w:ascii="Times New Roman" w:hAnsi="Times New Roman" w:cs="Times New Roman" w:eastAsia="Times New Roman"/>
+                <w:sz w:val="24"/>
               </w:rPr>
               <w:t xml:space="preserve">ra [-1,-1,0,3,3]; so_doi=3</w:t>
             </w:r>
@@ -13016,6 +13089,7 @@
             <w:r>
               <w:rPr>
                 <w:rFonts w:ascii="Times New Roman" w:hAnsi="Times New Roman" w:cs="Times New Roman" w:eastAsia="Times New Roman"/>
+                <w:sz w:val="24"/>
               </w:rPr>
               <w:t xml:space="preserve">KT02</w:t>
             </w:r>
@@ -13033,6 +13107,7 @@
             <w:r>
               <w:rPr>
                 <w:rFonts w:ascii="Times New Roman" w:hAnsi="Times New Roman" w:cs="Times New Roman" w:eastAsia="Times New Roman"/>
+                <w:sz w:val="24"/>
               </w:rPr>
               <w:t xml:space="preserve">Hai đầu biên 10^6 / sap_xep_lua_chon</w:t>
             </w:r>
@@ -13050,6 +13125,7 @@
             <w:r>
               <w:rPr>
                 <w:rFonts w:ascii="Times New Roman" w:hAnsi="Times New Roman" w:cs="Times New Roman" w:eastAsia="Times New Roman"/>
+                <w:sz w:val="24"/>
               </w:rPr>
               <w:t xml:space="preserve">[1000000,-1000000,0]</w:t>
             </w:r>
@@ -13067,6 +13143,7 @@
             <w:r>
               <w:rPr>
                 <w:rFonts w:ascii="Times New Roman" w:hAnsi="Times New Roman" w:cs="Times New Roman" w:eastAsia="Times New Roman"/>
+                <w:sz w:val="24"/>
               </w:rPr>
               <w:t xml:space="preserve">ra [-1000000,0,1000000]; so_doi=2</w:t>
             </w:r>
@@ -13090,6 +13167,7 @@
             <w:r>
               <w:rPr>
                 <w:rFonts w:ascii="Times New Roman" w:hAnsi="Times New Roman" w:cs="Times New Roman" w:eastAsia="Times New Roman"/>
+                <w:sz w:val="24"/>
               </w:rPr>
               <w:t xml:space="preserve">KT03</w:t>
             </w:r>
@@ -13107,6 +13185,7 @@
             <w:r>
               <w:rPr>
                 <w:rFonts w:ascii="Times New Roman" w:hAnsi="Times New Roman" w:cs="Times New Roman" w:eastAsia="Times New Roman"/>
+                <w:sz w:val="24"/>
               </w:rPr>
               <w:t xml:space="preserve">n=2 nghịch thế / sap_xep_lua_chon</w:t>
             </w:r>
@@ -13124,6 +13203,7 @@
             <w:r>
               <w:rPr>
                 <w:rFonts w:ascii="Times New Roman" w:hAnsi="Times New Roman" w:cs="Times New Roman" w:eastAsia="Times New Roman"/>
+                <w:sz w:val="24"/>
               </w:rPr>
               <w:t xml:space="preserve">[2,1]</w:t>
             </w:r>
@@ -13141,6 +13221,7 @@
             <w:r>
               <w:rPr>
                 <w:rFonts w:ascii="Times New Roman" w:hAnsi="Times New Roman" w:cs="Times New Roman" w:eastAsia="Times New Roman"/>
+                <w:sz w:val="24"/>
               </w:rPr>
               <w:t xml:space="preserve">ra [1,2]; so_sanh=1; so_doi=1</w:t>
             </w:r>
@@ -13164,6 +13245,7 @@
             <w:r>
               <w:rPr>
                 <w:rFonts w:ascii="Times New Roman" w:hAnsi="Times New Roman" w:cs="Times New Roman" w:eastAsia="Times New Roman"/>
+                <w:sz w:val="24"/>
               </w:rPr>
               <w:t xml:space="preserve">KT04</w:t>
             </w:r>
@@ -13181,6 +13263,7 @@
             <w:r>
               <w:rPr>
                 <w:rFonts w:ascii="Times New Roman" w:hAnsi="Times New Roman" w:cs="Times New Roman" w:eastAsia="Times New Roman"/>
+                <w:sz w:val="24"/>
               </w:rPr>
               <w:t xml:space="preserve">100 phần tử bằng nhau / sap_xep_lua_chon</w:t>
             </w:r>
@@ -13198,6 +13281,7 @@
             <w:r>
               <w:rPr>
                 <w:rFonts w:ascii="Times New Roman" w:hAnsi="Times New Roman" w:cs="Times New Roman" w:eastAsia="Times New Roman"/>
+                <w:sz w:val="24"/>
               </w:rPr>
               <w:t xml:space="preserve">fill(1,100)</w:t>
             </w:r>
@@ -13215,6 +13299,7 @@
             <w:r>
               <w:rPr>
                 <w:rFonts w:ascii="Times New Roman" w:hAnsi="Times New Roman" w:cs="Times New Roman" w:eastAsia="Times New Roman"/>
+                <w:sz w:val="24"/>
               </w:rPr>
               <w:t xml:space="preserve">ra 1×100; so_sanh=4950; so_doi=0</w:t>
             </w:r>
@@ -13238,6 +13323,7 @@
             <w:r>
               <w:rPr>
                 <w:rFonts w:ascii="Times New Roman" w:hAnsi="Times New Roman" w:cs="Times New Roman" w:eastAsia="Times New Roman"/>
+                <w:sz w:val="24"/>
               </w:rPr>
               <w:t xml:space="preserve">KT05</w:t>
             </w:r>
@@ -13255,6 +13341,7 @@
             <w:r>
               <w:rPr>
                 <w:rFonts w:ascii="Times New Roman" w:hAnsi="Times New Roman" w:cs="Times New Roman" w:eastAsia="Times New Roman"/>
+                <w:sz w:val="24"/>
               </w:rPr>
               <w:t xml:space="preserve">50 phần tử sinh theo công thức / sap_xep_lua_chon</w:t>
             </w:r>
@@ -13272,6 +13359,7 @@
             <w:r>
               <w:rPr>
                 <w:rFonts w:ascii="Times New Roman" w:hAnsi="Times New Roman" w:cs="Times New Roman" w:eastAsia="Times New Roman"/>
+                <w:sz w:val="24"/>
               </w:rPr>
               <w:t xml:space="preserve">mod(37i,201)-100</w:t>
             </w:r>
@@ -13289,6 +13377,7 @@
             <w:r>
               <w:rPr>
                 <w:rFonts w:ascii="Times New Roman" w:hAnsi="Times New Roman" w:cs="Times New Roman" w:eastAsia="Times New Roman"/>
+                <w:sz w:val="24"/>
               </w:rPr>
               <w:t xml:space="preserve">đối chiếu sort; so_sanh=1225</w:t>
             </w:r>
@@ -13312,6 +13401,7 @@
             <w:r>
               <w:rPr>
                 <w:rFonts w:ascii="Times New Roman" w:hAnsi="Times New Roman" w:cs="Times New Roman" w:eastAsia="Times New Roman"/>
+                <w:sz w:val="24"/>
               </w:rPr>
               <w:t xml:space="preserve">LOI01</w:t>
             </w:r>
@@ -13329,6 +13419,7 @@
             <w:r>
               <w:rPr>
                 <w:rFonts w:ascii="Times New Roman" w:hAnsi="Times New Roman" w:cs="Times New Roman" w:eastAsia="Times New Roman"/>
+                <w:sz w:val="24"/>
               </w:rPr>
               <w:t xml:space="preserve">Input sai / kiem_tra_dau_vao</w:t>
             </w:r>
@@ -13346,6 +13437,7 @@
             <w:r>
               <w:rPr>
                 <w:rFonts w:ascii="Times New Roman" w:hAnsi="Times New Roman" w:cs="Times New Roman" w:eastAsia="Times New Roman"/>
+                <w:sz w:val="24"/>
               </w:rPr>
               <w:t xml:space="preserve">n=2001; |a[i]|=10^6+1; Float64</w:t>
             </w:r>
@@ -13363,6 +13455,7 @@
             <w:r>
               <w:rPr>
                 <w:rFonts w:ascii="Times New Roman" w:hAnsi="Times New Roman" w:cs="Times New Roman" w:eastAsia="Times New Roman"/>
+                <w:sz w:val="24"/>
               </w:rPr>
               <w:t xml:space="preserve">ném ArgumentError cả 3 kiểu</w:t>
             </w:r>
@@ -14552,7 +14645,6 @@
     <w:p>
       <w:pPr>
         <w:pStyle w:val="Heading2"/>
-        <w:pageBreakBefore/>
         <w:spacing w:before="0" w:after="100" w:line="269" w:lineRule="auto"/>
         <w:ind w:firstLine="0"/>
         <w:jc w:val="center"/>
@@ -14951,7 +15043,7 @@
         <w:rPr>
           <w:rFonts w:ascii="Times New Roman" w:hAnsi="Times New Roman" w:cs="Times New Roman" w:eastAsia="Times New Roman"/>
         </w:rPr>
-        <w:t>Mục đích: mảng giảm dần — trường hợp tiết kiệm đổi chỗ rõ nhất. Input [9,7,5,3,1], expected [1,3,5,7,9]. Actual khớp: 10 so sánh nhưng chỉ 2 đổi chỗ. Chạy đối chứng sap_xep_doi_cho trên cùng input cho 10 đổi chỗ (đúng bằng số nghịch thế; log tại evidence/logs/so_sanh.log, chạy tại C); hai mảng khác cũng lệch rõ: [8,3,5,1,9,2] là 5 so với 9, [5,1,4,1,3] là 4 so với 6. Hàm đối chứng được kiểm trong testset “Doi chung sap xep doi cho” và “Ham con tim_min_doan” với các assert lc.mang == dc.mang == sort(a), lc.so_sanh == dc.so_sanh và lc.so_doi ≤ dc.so_doi.</w:t>
+        <w:t>Mục đích: mảng giảm dần — trường hợp tiết kiệm đổi chỗ rõ nhất. Input [9,7,5,3,1], expected [1,3,5,7,9]. Actual khớp: 10 so sánh nhưng chỉ 2 đổi chỗ. Chạy đối chứng sap_xep_doi_cho trên cùng input cho 10 đổi chỗ (đúng bằng số nghịch thế; log tại evidence/logs/so_sanh.log và nghich_the.log, chạy tại C); hai mảng khác cũng lệch rõ: [8,3,5,1,9,2] là 5 so với 9, [5,1,4,1,3] là 4 so với 6. Hàm đối chứng được kiểm trong testset “Doi chung sap xep doi cho” và “Ham con tim_min_doan” với các assert lc.mang == dc.mang == sort(a), lc.so_sanh == dc.so_sanh và lc.so_doi ≤ dc.so_doi.</w:t>
       </w:r>
     </w:p>
     <w:tbl>
@@ -16264,7 +16356,7 @@
         <w:rPr>
           <w:rFonts w:ascii="Times New Roman" w:hAnsi="Times New Roman" w:cs="Times New Roman" w:eastAsia="Times New Roman"/>
         </w:rPr>
-        <w:t>URL repo, SHA chạy C và permalink hàm chính/test tại C được ghi ở Bảng 4.5; SHA nộp S ghi trong ThongTinNop.txt nộp rời. Ảnh A01–A09 được chụp tại bản làm việc commit 5b08e00, không phải tại C: 5b08e00 là commit sau C, chỉ thêm ảnh minh chứng và log, còn mã nguồn, bộ kiểm thử và bench giống hệt C. Đối chứng bằng lệnh dưới đây, kết quả rỗng:</w:t>
+        <w:t>URL repo, SHA chạy C và permalink hàm chính/test tại C được ghi ở Bảng 4.5; SHA nộp S ghi trong ThongTinNop.txt nộp rời. Ảnh A01–A11 là bản cuối được chốt tại S 2291f891, không phải tại C: S là commit sau C, thêm ảnh minh chứng và log, còn mã nguồn, bộ kiểm thử và bench giống hệt C. Đối chứng bằng lệnh dưới đây, kết quả rỗng:</w:t>
       </w:r>
     </w:p>
     <w:p>
@@ -16278,7 +16370,7 @@
           <w:rFonts w:ascii="Consolas" w:hAnsi="Consolas"/>
           <w:sz w:val="18"/>
         </w:rPr>
-        <w:t>$ git diff --stat e0db818 5b08e00 -- bin src spec bench</w:t>
+        <w:t>$ git diff --stat e0db818 2291f891 -- bin src spec bench</w:t>
       </w:r>
     </w:p>
     <w:p>
@@ -16489,7 +16581,7 @@
               <w:rPr>
                 <w:rFonts w:ascii="Times New Roman" w:hAnsi="Times New Roman" w:cs="Times New Roman" w:eastAsia="Times New Roman"/>
               </w:rPr>
-              <w:t>A01–A09 chụp từ bản làm việc tại commit 5b08e00 (mã giống hệt C — diff rỗng); A10 là bản clone tại C e0db818; A11 là trang commit C trên GitHub.</w:t>
+              <w:t>A01–A11 là bản cuối chốt tại S 2291f891 (mã giống hệt C — diff rỗng); A10 là bản clone tại C e0db818; A11 là trang commit C trên GitHub.</w:t>
             </w:r>
           </w:p>
         </w:tc>
@@ -16528,7 +16620,7 @@
               <w:rPr>
                 <w:rFonts w:ascii="Times New Roman" w:hAnsi="Times New Roman" w:cs="Times New Roman" w:eastAsia="Times New Roman"/>
               </w:rPr>
-              <w:t xml:space="preserve">Commit S sau khi thêm báo cáo/ảnh — ghi trong ThongTinNop.txt</w:t>
+              <w:t>S = 2291f891 (commit đóng gói báo cáo, mã, ảnh, log) — ghi trong ThongTinNop.txt</w:t>
             </w:r>
           </w:p>
         </w:tc>
@@ -16606,7 +16698,7 @@
               <w:rPr>
                 <w:rFonts w:ascii="Times New Roman" w:hAnsi="Times New Roman" w:cs="Times New Roman" w:eastAsia="Times New Roman"/>
               </w:rPr>
-              <w:t xml:space="preserve">Không đổi — S chỉ thêm báo cáo/ảnh; git diff C S -- bin src spec bench rỗng</w:t>
+              <w:t>Không đổi — S chỉ thêm báo cáo, ảnh và hồ sơ nộp; git diff C S -- bin src spec bench rỗng</w:t>
             </w:r>
           </w:p>
         </w:tc>
@@ -18502,7 +18594,7 @@
         <w:rPr>
           <w:i/>
         </w:rPr>
-        <w:t>Ghi chú: ngoài 11 ảnh trên, gói mã nguồn còn tệp 12_trace_VD01.png là ảnh lần vết VD01 để tham khảo, không tính trong 11 ảnh minh chứng.</w:t>
+        <w:t>Ghi chú: ngoài 11 ảnh trên, gói mã nguồn còn tệp 12_trace_VD01.png là ảnh lần vết VD01 để tham khảo, không tính trong 11 ảnh minh chứng. Ảnh được chụp ở các thư mục làm việc khác nhau; đường dẫn trong ảnh là thư mục chạy, không phải dữ liệu cá nhân.</w:t>
       </w:r>
     </w:p>
     <w:p>
@@ -19038,7 +19130,7 @@
         <w:rPr>
           <w:rFonts w:ascii="Times New Roman" w:hAnsi="Times New Roman" w:cs="Times New Roman" w:eastAsia="Times New Roman"/>
         </w:rPr>
-        <w:t>SHA C đầy đủ: e0db818fda1007c79bda71b8076cf6ccc7fa73a8     SHA S: 2dbb6921d01124c6d9a1897afa97aace1e53654c</w:t>
+        <w:t>SHA C đầy đủ: e0db818fda1007c79bda71b8076cf6ccc7fa73a8     SHA S: 2291f891e1aeceb8499f4612f4586b1ed39b71ed</w:t>
       </w:r>
     </w:p>
     <w:p>

</xml_diff>